<commit_message>
fix: clarify MATS biosecurity affiliation
</commit_message>
<xml_diff>
--- a/Noga_Aharony_CV_Academic_August_2026.docx
+++ b/Noga_Aharony_CV_Academic_August_2026.docx
@@ -381,7 +381,7 @@
                 <w:i w:val="0"/>
                 <w:sz w:val="18"/>
               </w:rPr>
-              <w:t>MATS Autumn 2026</w:t>
+              <w:t>ML Alignment &amp; Theory Scholars (MATS), Autumn 2026</w:t>
             </w:r>
             <w:r>
               <w:rPr>
@@ -390,7 +390,7 @@
                 <w:sz w:val="18"/>
               </w:rPr>
               <w:br/>
-              <w:t>Participant in the Ralston/Petty Founding &amp; Field-Building stream.</w:t>
+              <w:t>Biosecurity stream in the Founding &amp; Field-Building track, mentored by Geoff Ralston and Charlie Petty; working on the Bio Action Plan for catastrophic biological risk in the age of AI.</w:t>
             </w:r>
           </w:p>
         </w:tc>
@@ -2077,7 +2077,7 @@
                 <w:i w:val="0"/>
                 <w:sz w:val="18"/>
               </w:rPr>
-              <w:t>MATS Autumn 2026.</w:t>
+              <w:t>ML Alignment &amp; Theory Scholars (MATS) Program, Autumn 2026.</w:t>
             </w:r>
           </w:p>
         </w:tc>

</xml_diff>

<commit_message>
fix: polish three-page CV layout
</commit_message>
<xml_diff>
--- a/Noga_Aharony_CV_Academic_August_2026.docx
+++ b/Noga_Aharony_CV_Academic_August_2026.docx
@@ -70,6 +70,9 @@
         <w:gridCol w:w="5040"/>
       </w:tblGrid>
       <w:tr>
+        <w:trPr>
+          <w:cantSplit/>
+        </w:trPr>
         <w:tc>
           <w:tcPr>
             <w:tcW w:type="dxa" w:w="1555"/>
@@ -77,7 +80,7 @@
           </w:tcPr>
           <w:p>
             <w:pPr>
-              <w:spacing w:after="30"/>
+              <w:spacing w:after="20"/>
             </w:pPr>
             <w:r>
               <w:rPr>
@@ -96,13 +99,13 @@
           </w:tcPr>
           <w:p>
             <w:pPr>
-              <w:spacing w:after="30"/>
+              <w:spacing w:after="20"/>
             </w:pPr>
             <w:r>
               <w:rPr>
                 <w:b/>
                 <w:i w:val="0"/>
-                <w:sz w:val="18"/>
+                <w:sz w:val="17"/>
               </w:rPr>
               <w:t>Doctor of Philosophy, Systems Biology</w:t>
             </w:r>
@@ -110,7 +113,7 @@
               <w:rPr>
                 <w:b w:val="0"/>
                 <w:i w:val="0"/>
-                <w:sz w:val="18"/>
+                <w:sz w:val="17"/>
               </w:rPr>
               <w:t>, Columbia University</w:t>
             </w:r>
@@ -121,7 +124,7 @@
               <w:rPr>
                 <w:b w:val="0"/>
                 <w:i w:val="0"/>
-                <w:sz w:val="18"/>
+                <w:sz w:val="17"/>
               </w:rPr>
               <w:t>Thesis: Systematic Evaluation Frameworks for Foundational Genome Language Models Development</w:t>
             </w:r>
@@ -132,7 +135,7 @@
               <w:rPr>
                 <w:b w:val="0"/>
                 <w:i w:val="0"/>
-                <w:sz w:val="18"/>
+                <w:sz w:val="17"/>
               </w:rPr>
               <w:t>Advisor: Mohammed AlQuraishi, PhD</w:t>
             </w:r>
@@ -140,6 +143,9 @@
         </w:tc>
       </w:tr>
       <w:tr>
+        <w:trPr>
+          <w:cantSplit/>
+        </w:trPr>
         <w:tc>
           <w:tcPr>
             <w:tcW w:type="dxa" w:w="1555"/>
@@ -147,7 +153,7 @@
           </w:tcPr>
           <w:p>
             <w:pPr>
-              <w:spacing w:after="30"/>
+              <w:spacing w:after="20"/>
             </w:pPr>
             <w:r>
               <w:rPr>
@@ -166,13 +172,13 @@
           </w:tcPr>
           <w:p>
             <w:pPr>
-              <w:spacing w:after="30"/>
+              <w:spacing w:after="20"/>
             </w:pPr>
             <w:r>
               <w:rPr>
                 <w:b/>
                 <w:i w:val="0"/>
-                <w:sz w:val="18"/>
+                <w:sz w:val="17"/>
               </w:rPr>
               <w:t>Master of Science, Biology</w:t>
             </w:r>
@@ -180,7 +186,7 @@
               <w:rPr>
                 <w:b w:val="0"/>
                 <w:i w:val="0"/>
-                <w:sz w:val="18"/>
+                <w:sz w:val="17"/>
               </w:rPr>
               <w:t>, Technion - Israel Institute of Technology</w:t>
             </w:r>
@@ -191,7 +197,7 @@
               <w:rPr>
                 <w:b w:val="0"/>
                 <w:i w:val="0"/>
-                <w:sz w:val="18"/>
+                <w:sz w:val="17"/>
               </w:rPr>
               <w:t>Thesis: Rapid Gene Content Alteration in Recurring Infections</w:t>
             </w:r>
@@ -202,7 +208,7 @@
               <w:rPr>
                 <w:b w:val="0"/>
                 <w:i w:val="0"/>
-                <w:sz w:val="18"/>
+                <w:sz w:val="17"/>
               </w:rPr>
               <w:t>Advisor: Roy Kishony, PhD</w:t>
             </w:r>
@@ -210,6 +216,9 @@
         </w:tc>
       </w:tr>
       <w:tr>
+        <w:trPr>
+          <w:cantSplit/>
+        </w:trPr>
         <w:tc>
           <w:tcPr>
             <w:tcW w:type="dxa" w:w="1555"/>
@@ -217,7 +226,7 @@
           </w:tcPr>
           <w:p>
             <w:pPr>
-              <w:spacing w:after="30"/>
+              <w:spacing w:after="20"/>
             </w:pPr>
             <w:r>
               <w:rPr>
@@ -236,13 +245,13 @@
           </w:tcPr>
           <w:p>
             <w:pPr>
-              <w:spacing w:after="30"/>
+              <w:spacing w:after="20"/>
             </w:pPr>
             <w:r>
               <w:rPr>
                 <w:b/>
                 <w:i w:val="0"/>
-                <w:sz w:val="18"/>
+                <w:sz w:val="17"/>
               </w:rPr>
               <w:t>Bachelor of Science, Honours Neuroscience</w:t>
             </w:r>
@@ -250,7 +259,7 @@
               <w:rPr>
                 <w:b w:val="0"/>
                 <w:i w:val="0"/>
-                <w:sz w:val="18"/>
+                <w:sz w:val="17"/>
               </w:rPr>
               <w:t>, McGill University</w:t>
             </w:r>
@@ -261,7 +270,7 @@
               <w:rPr>
                 <w:b w:val="0"/>
                 <w:i w:val="0"/>
-                <w:sz w:val="18"/>
+                <w:sz w:val="17"/>
               </w:rPr>
               <w:t>First Class Honours; Dean's Honours List; Dean's Multidisciplinary Research List</w:t>
             </w:r>
@@ -298,6 +307,9 @@
         <w:gridCol w:w="5040"/>
       </w:tblGrid>
       <w:tr>
+        <w:trPr>
+          <w:cantSplit/>
+        </w:trPr>
         <w:tc>
           <w:tcPr>
             <w:tcW w:type="dxa" w:w="1555"/>
@@ -305,7 +317,7 @@
           </w:tcPr>
           <w:p>
             <w:pPr>
-              <w:spacing w:after="30"/>
+              <w:spacing w:after="20"/>
             </w:pPr>
             <w:r>
               <w:rPr>
@@ -324,13 +336,13 @@
           </w:tcPr>
           <w:p>
             <w:pPr>
-              <w:spacing w:after="30"/>
+              <w:spacing w:after="20"/>
             </w:pPr>
             <w:r>
               <w:rPr>
                 <w:b/>
                 <w:i w:val="0"/>
-                <w:sz w:val="18"/>
+                <w:sz w:val="17"/>
               </w:rPr>
               <w:t>Pivotal Research Frontier Biodefense Fellow</w:t>
             </w:r>
@@ -338,7 +350,7 @@
               <w:rPr>
                 <w:b w:val="0"/>
                 <w:i w:val="0"/>
-                <w:sz w:val="18"/>
+                <w:sz w:val="17"/>
               </w:rPr>
               <w:br/>
               <w:t>Developing reference-free methods to detect engineered DNA in metagenomic sequencing data.</w:t>
@@ -347,6 +359,9 @@
         </w:tc>
       </w:tr>
       <w:tr>
+        <w:trPr>
+          <w:cantSplit/>
+        </w:trPr>
         <w:tc>
           <w:tcPr>
             <w:tcW w:type="dxa" w:w="1555"/>
@@ -354,7 +369,7 @@
           </w:tcPr>
           <w:p>
             <w:pPr>
-              <w:spacing w:after="30"/>
+              <w:spacing w:after="20"/>
             </w:pPr>
             <w:r>
               <w:rPr>
@@ -373,13 +388,13 @@
           </w:tcPr>
           <w:p>
             <w:pPr>
-              <w:spacing w:after="30"/>
+              <w:spacing w:after="20"/>
             </w:pPr>
             <w:r>
               <w:rPr>
                 <w:b/>
                 <w:i w:val="0"/>
-                <w:sz w:val="18"/>
+                <w:sz w:val="17"/>
               </w:rPr>
               <w:t>ML Alignment &amp; Theory Scholars (MATS), Autumn 2026</w:t>
             </w:r>
@@ -387,7 +402,7 @@
               <w:rPr>
                 <w:b w:val="0"/>
                 <w:i w:val="0"/>
-                <w:sz w:val="18"/>
+                <w:sz w:val="17"/>
               </w:rPr>
               <w:br/>
               <w:t>Biosecurity stream in the Founding &amp; Field-Building track, mentored by Geoff Ralston and Charlie Petty; working on the Bio Action Plan for catastrophic biological risk in the age of AI.</w:t>
@@ -425,6 +440,9 @@
         <w:gridCol w:w="5040"/>
       </w:tblGrid>
       <w:tr>
+        <w:trPr>
+          <w:cantSplit/>
+        </w:trPr>
         <w:tc>
           <w:tcPr>
             <w:tcW w:type="dxa" w:w="1555"/>
@@ -432,7 +450,7 @@
           </w:tcPr>
           <w:p>
             <w:pPr>
-              <w:spacing w:after="30"/>
+              <w:spacing w:after="20"/>
             </w:pPr>
             <w:r>
               <w:rPr>
@@ -451,13 +469,13 @@
           </w:tcPr>
           <w:p>
             <w:pPr>
-              <w:spacing w:after="30"/>
+              <w:spacing w:after="20"/>
             </w:pPr>
             <w:r>
               <w:rPr>
                 <w:b/>
                 <w:i w:val="0"/>
-                <w:sz w:val="18"/>
+                <w:sz w:val="17"/>
               </w:rPr>
               <w:t>Mohammed AlQuraishi Lab</w:t>
             </w:r>
@@ -465,7 +483,7 @@
               <w:rPr>
                 <w:b w:val="0"/>
                 <w:i w:val="0"/>
-                <w:sz w:val="18"/>
+                <w:sz w:val="17"/>
               </w:rPr>
               <w:t>, Columbia University, Program of Mathematical Genomics</w:t>
             </w:r>
@@ -476,7 +494,7 @@
               <w:rPr>
                 <w:b w:val="0"/>
                 <w:i w:val="0"/>
-                <w:sz w:val="18"/>
+                <w:sz w:val="17"/>
               </w:rPr>
               <w:t>Developing evaluation frameworks and applications for biological language models, especially genome language models, across genomic context use, pathway-level reasoning, wastewater pathogen monitoring, and protein-protein interaction prediction. Co-developing GeneCtx for dissecting genomic context use and WAVEBench for evaluating genomic foundation models under realistic metagenomic distribution shifts.</w:t>
             </w:r>
@@ -484,6 +502,9 @@
         </w:tc>
       </w:tr>
       <w:tr>
+        <w:trPr>
+          <w:cantSplit/>
+        </w:trPr>
         <w:tc>
           <w:tcPr>
             <w:tcW w:type="dxa" w:w="1555"/>
@@ -491,7 +512,7 @@
           </w:tcPr>
           <w:p>
             <w:pPr>
-              <w:spacing w:after="30"/>
+              <w:spacing w:after="20"/>
             </w:pPr>
             <w:r>
               <w:rPr>
@@ -510,13 +531,13 @@
           </w:tcPr>
           <w:p>
             <w:pPr>
-              <w:spacing w:after="30"/>
+              <w:spacing w:after="20"/>
             </w:pPr>
             <w:r>
               <w:rPr>
                 <w:b/>
                 <w:i w:val="0"/>
-                <w:sz w:val="18"/>
+                <w:sz w:val="17"/>
               </w:rPr>
               <w:t>Tal Korem Lab</w:t>
             </w:r>
@@ -524,7 +545,7 @@
               <w:rPr>
                 <w:b w:val="0"/>
                 <w:i w:val="0"/>
-                <w:sz w:val="18"/>
+                <w:sz w:val="17"/>
               </w:rPr>
               <w:t>, Columbia University, Program of Mathematical Genomics</w:t>
             </w:r>
@@ -535,7 +556,7 @@
               <w:rPr>
                 <w:b w:val="0"/>
                 <w:i w:val="0"/>
-                <w:sz w:val="18"/>
+                <w:sz w:val="17"/>
               </w:rPr>
               <w:t>Created a model to detect small RNAs in bacterial genomes.</w:t>
             </w:r>
@@ -543,6 +564,9 @@
         </w:tc>
       </w:tr>
       <w:tr>
+        <w:trPr>
+          <w:cantSplit/>
+        </w:trPr>
         <w:tc>
           <w:tcPr>
             <w:tcW w:type="dxa" w:w="1555"/>
@@ -550,7 +574,7 @@
           </w:tcPr>
           <w:p>
             <w:pPr>
-              <w:spacing w:after="30"/>
+              <w:spacing w:after="20"/>
             </w:pPr>
             <w:r>
               <w:rPr>
@@ -569,13 +593,13 @@
           </w:tcPr>
           <w:p>
             <w:pPr>
-              <w:spacing w:after="30"/>
+              <w:spacing w:after="20"/>
             </w:pPr>
             <w:r>
               <w:rPr>
                 <w:b/>
                 <w:i w:val="0"/>
-                <w:sz w:val="18"/>
+                <w:sz w:val="17"/>
               </w:rPr>
               <w:t>Itsik Pe'er Lab</w:t>
             </w:r>
@@ -583,7 +607,7 @@
               <w:rPr>
                 <w:b w:val="0"/>
                 <w:i w:val="0"/>
-                <w:sz w:val="18"/>
+                <w:sz w:val="17"/>
               </w:rPr>
               <w:t>, Columbia University, Department of Computer Science</w:t>
             </w:r>
@@ -594,7 +618,7 @@
               <w:rPr>
                 <w:b w:val="0"/>
                 <w:i w:val="0"/>
-                <w:sz w:val="18"/>
+                <w:sz w:val="17"/>
               </w:rPr>
               <w:t>Developed a neural embedding model in hyperbolic spaces to better predict small proteins.</w:t>
             </w:r>
@@ -602,6 +626,9 @@
         </w:tc>
       </w:tr>
       <w:tr>
+        <w:trPr>
+          <w:cantSplit/>
+        </w:trPr>
         <w:tc>
           <w:tcPr>
             <w:tcW w:type="dxa" w:w="1555"/>
@@ -609,7 +636,7 @@
           </w:tcPr>
           <w:p>
             <w:pPr>
-              <w:spacing w:after="30"/>
+              <w:spacing w:after="20"/>
             </w:pPr>
             <w:r>
               <w:rPr>
@@ -628,13 +655,13 @@
           </w:tcPr>
           <w:p>
             <w:pPr>
-              <w:spacing w:after="30"/>
+              <w:spacing w:after="20"/>
             </w:pPr>
             <w:r>
               <w:rPr>
                 <w:b/>
                 <w:i w:val="0"/>
-                <w:sz w:val="18"/>
+                <w:sz w:val="17"/>
               </w:rPr>
               <w:t>Roy Kishony Lab</w:t>
             </w:r>
@@ -642,7 +669,7 @@
               <w:rPr>
                 <w:b w:val="0"/>
                 <w:i w:val="0"/>
-                <w:sz w:val="18"/>
+                <w:sz w:val="17"/>
               </w:rPr>
               <w:t>, Technion - Israel Institute of Technology, Department of Biology</w:t>
             </w:r>
@@ -653,7 +680,7 @@
               <w:rPr>
                 <w:b w:val="0"/>
                 <w:i w:val="0"/>
-                <w:sz w:val="18"/>
+                <w:sz w:val="17"/>
               </w:rPr>
               <w:t>Constructed a computational pipeline to identify mobile genetic elements in recurring infections. Designed experiments unraveling eco-evolutionary dynamics of microbial communities.</w:t>
             </w:r>
@@ -661,6 +688,9 @@
         </w:tc>
       </w:tr>
       <w:tr>
+        <w:trPr>
+          <w:cantSplit/>
+        </w:trPr>
         <w:tc>
           <w:tcPr>
             <w:tcW w:type="dxa" w:w="1555"/>
@@ -668,7 +698,7 @@
           </w:tcPr>
           <w:p>
             <w:pPr>
-              <w:spacing w:after="30"/>
+              <w:spacing w:after="20"/>
             </w:pPr>
             <w:r>
               <w:rPr>
@@ -687,13 +717,13 @@
           </w:tcPr>
           <w:p>
             <w:pPr>
-              <w:spacing w:after="30"/>
+              <w:spacing w:after="20"/>
             </w:pPr>
             <w:r>
               <w:rPr>
                 <w:b/>
                 <w:i w:val="0"/>
-                <w:sz w:val="18"/>
+                <w:sz w:val="17"/>
               </w:rPr>
               <w:t>Amine Kamen Lab</w:t>
             </w:r>
@@ -701,7 +731,7 @@
               <w:rPr>
                 <w:b w:val="0"/>
                 <w:i w:val="0"/>
-                <w:sz w:val="18"/>
+                <w:sz w:val="17"/>
               </w:rPr>
               <w:t>, McGill University, Department of Bioengineering</w:t>
             </w:r>
@@ -712,7 +742,7 @@
               <w:rPr>
                 <w:b w:val="0"/>
                 <w:i w:val="0"/>
-                <w:sz w:val="18"/>
+                <w:sz w:val="17"/>
               </w:rPr>
               <w:t>Designed and manufactured adeno-associated viruses carrying Cas9 for improved CAR-T cell engineering.</w:t>
             </w:r>
@@ -720,6 +750,9 @@
         </w:tc>
       </w:tr>
       <w:tr>
+        <w:trPr>
+          <w:cantSplit/>
+        </w:trPr>
         <w:tc>
           <w:tcPr>
             <w:tcW w:type="dxa" w:w="1555"/>
@@ -727,7 +760,7 @@
           </w:tcPr>
           <w:p>
             <w:pPr>
-              <w:spacing w:after="30"/>
+              <w:spacing w:after="20"/>
             </w:pPr>
             <w:r>
               <w:rPr>
@@ -746,13 +779,13 @@
           </w:tcPr>
           <w:p>
             <w:pPr>
-              <w:spacing w:after="30"/>
+              <w:spacing w:after="20"/>
             </w:pPr>
             <w:r>
               <w:rPr>
                 <w:b/>
                 <w:i w:val="0"/>
-                <w:sz w:val="18"/>
+                <w:sz w:val="17"/>
               </w:rPr>
               <w:t>Center for Health Security</w:t>
             </w:r>
@@ -760,7 +793,7 @@
               <w:rPr>
                 <w:b w:val="0"/>
                 <w:i w:val="0"/>
-                <w:sz w:val="18"/>
+                <w:sz w:val="17"/>
               </w:rPr>
               <w:t>, Johns Hopkins University, School of Public Health</w:t>
             </w:r>
@@ -771,7 +804,7 @@
               <w:rPr>
                 <w:b w:val="0"/>
                 <w:i w:val="0"/>
-                <w:sz w:val="18"/>
+                <w:sz w:val="17"/>
               </w:rPr>
               <w:t xml:space="preserve">Surveyed DNA synthesis providers' sequence- and customer-screening practices; this work informed the Health Security governance paper </w:t>
             </w:r>
@@ -779,7 +812,7 @@
               <w:rPr>
                 <w:b w:val="0"/>
                 <w:i/>
-                <w:sz w:val="18"/>
+                <w:sz w:val="17"/>
               </w:rPr>
               <w:t>Strengthening Security for Gene Synthesis</w:t>
             </w:r>
@@ -787,7 +820,7 @@
               <w:rPr>
                 <w:b w:val="0"/>
                 <w:i w:val="0"/>
-                <w:sz w:val="18"/>
+                <w:sz w:val="17"/>
               </w:rPr>
               <w:t>. Studied safety, innovation, and community norms in the DIY biology community.</w:t>
             </w:r>
@@ -795,6 +828,9 @@
         </w:tc>
       </w:tr>
       <w:tr>
+        <w:trPr>
+          <w:cantSplit/>
+        </w:trPr>
         <w:tc>
           <w:tcPr>
             <w:tcW w:type="dxa" w:w="1555"/>
@@ -802,7 +838,7 @@
           </w:tcPr>
           <w:p>
             <w:pPr>
-              <w:spacing w:after="30"/>
+              <w:spacing w:after="20"/>
             </w:pPr>
             <w:r>
               <w:rPr>
@@ -821,13 +857,13 @@
           </w:tcPr>
           <w:p>
             <w:pPr>
-              <w:spacing w:after="30"/>
+              <w:spacing w:after="20"/>
             </w:pPr>
             <w:r>
               <w:rPr>
                 <w:b/>
                 <w:i w:val="0"/>
-                <w:sz w:val="18"/>
+                <w:sz w:val="17"/>
               </w:rPr>
               <w:t>Jonathan Kimmelman Lab</w:t>
             </w:r>
@@ -835,7 +871,7 @@
               <w:rPr>
                 <w:b w:val="0"/>
                 <w:i w:val="0"/>
-                <w:sz w:val="18"/>
+                <w:sz w:val="17"/>
               </w:rPr>
               <w:t>, McGill University, Biomedical Ethics Unit</w:t>
             </w:r>
@@ -846,7 +882,7 @@
               <w:rPr>
                 <w:b w:val="0"/>
                 <w:i w:val="0"/>
-                <w:sz w:val="18"/>
+                <w:sz w:val="17"/>
               </w:rPr>
               <w:t>Applied machine learning to analyze clinical trial design factors that influence forecasts of outcomes; contributed to a meta-analysis.</w:t>
             </w:r>
@@ -854,6 +890,9 @@
         </w:tc>
       </w:tr>
       <w:tr>
+        <w:trPr>
+          <w:cantSplit/>
+        </w:trPr>
         <w:tc>
           <w:tcPr>
             <w:tcW w:type="dxa" w:w="1555"/>
@@ -861,7 +900,7 @@
           </w:tcPr>
           <w:p>
             <w:pPr>
-              <w:spacing w:after="30"/>
+              <w:spacing w:after="20"/>
             </w:pPr>
             <w:r>
               <w:rPr>
@@ -880,13 +919,13 @@
           </w:tcPr>
           <w:p>
             <w:pPr>
-              <w:spacing w:after="30"/>
+              <w:spacing w:after="20"/>
             </w:pPr>
             <w:r>
               <w:rPr>
                 <w:b/>
                 <w:i w:val="0"/>
-                <w:sz w:val="18"/>
+                <w:sz w:val="17"/>
               </w:rPr>
               <w:t>Edward Ruthazer Lab</w:t>
             </w:r>
@@ -894,7 +933,7 @@
               <w:rPr>
                 <w:b w:val="0"/>
                 <w:i w:val="0"/>
-                <w:sz w:val="18"/>
+                <w:sz w:val="17"/>
               </w:rPr>
               <w:t>, McGill University, Montreal Neurological Institute</w:t>
             </w:r>
@@ -905,7 +944,7 @@
               <w:rPr>
                 <w:b w:val="0"/>
                 <w:i w:val="0"/>
-                <w:sz w:val="18"/>
+                <w:sz w:val="17"/>
               </w:rPr>
               <w:t>Electroporated and imaged tadpoles to study structural plasticity in the developing visual system.</w:t>
             </w:r>
@@ -913,6 +952,9 @@
         </w:tc>
       </w:tr>
       <w:tr>
+        <w:trPr>
+          <w:cantSplit/>
+        </w:trPr>
         <w:tc>
           <w:tcPr>
             <w:tcW w:type="dxa" w:w="1555"/>
@@ -920,7 +962,7 @@
           </w:tcPr>
           <w:p>
             <w:pPr>
-              <w:spacing w:after="30"/>
+              <w:spacing w:after="20"/>
             </w:pPr>
             <w:r>
               <w:rPr>
@@ -939,13 +981,13 @@
           </w:tcPr>
           <w:p>
             <w:pPr>
-              <w:spacing w:after="30"/>
+              <w:spacing w:after="20"/>
             </w:pPr>
             <w:r>
               <w:rPr>
                 <w:b/>
                 <w:i w:val="0"/>
-                <w:sz w:val="18"/>
+                <w:sz w:val="17"/>
               </w:rPr>
               <w:t>Rafael Najmanovich Lab</w:t>
             </w:r>
@@ -953,7 +995,7 @@
               <w:rPr>
                 <w:b w:val="0"/>
                 <w:i w:val="0"/>
-                <w:sz w:val="18"/>
+                <w:sz w:val="17"/>
               </w:rPr>
               <w:t>, University of Montreal, Department of Pharmacology and Physiology</w:t>
             </w:r>
@@ -964,7 +1006,7 @@
               <w:rPr>
                 <w:b w:val="0"/>
                 <w:i w:val="0"/>
-                <w:sz w:val="18"/>
+                <w:sz w:val="17"/>
               </w:rPr>
               <w:t xml:space="preserve">Developed software characterizing protein interfaces based on surrounding force fields. Modeled biophysical features of </w:t>
             </w:r>
@@ -972,7 +1014,7 @@
               <w:rPr>
                 <w:b w:val="0"/>
                 <w:i/>
-                <w:sz w:val="18"/>
+                <w:sz w:val="17"/>
               </w:rPr>
               <w:t>C. difficile</w:t>
             </w:r>
@@ -980,7 +1022,7 @@
               <w:rPr>
                 <w:b w:val="0"/>
                 <w:i w:val="0"/>
-                <w:sz w:val="18"/>
+                <w:sz w:val="17"/>
               </w:rPr>
               <w:t xml:space="preserve"> germination protease to identify candidate inhibiting ligands.</w:t>
             </w:r>
@@ -1017,6 +1059,9 @@
         <w:gridCol w:w="5040"/>
       </w:tblGrid>
       <w:tr>
+        <w:trPr>
+          <w:cantSplit/>
+        </w:trPr>
         <w:tc>
           <w:tcPr>
             <w:tcW w:type="dxa" w:w="1555"/>
@@ -1024,7 +1069,7 @@
           </w:tcPr>
           <w:p>
             <w:pPr>
-              <w:spacing w:after="30"/>
+              <w:spacing w:after="20"/>
             </w:pPr>
             <w:r>
               <w:rPr>
@@ -1043,13 +1088,13 @@
           </w:tcPr>
           <w:p>
             <w:pPr>
-              <w:spacing w:after="30"/>
+              <w:spacing w:after="20"/>
             </w:pPr>
             <w:r>
               <w:rPr>
                 <w:b w:val="0"/>
                 <w:i w:val="0"/>
-                <w:sz w:val="18"/>
+                <w:sz w:val="17"/>
               </w:rPr>
               <w:t xml:space="preserve">Le Lievre T*, </w:t>
             </w:r>
@@ -1057,7 +1102,7 @@
               <w:rPr>
                 <w:b/>
                 <w:i w:val="0"/>
-                <w:sz w:val="18"/>
+                <w:sz w:val="17"/>
               </w:rPr>
               <w:t>Aharony N*</w:t>
             </w:r>
@@ -1065,7 +1110,7 @@
               <w:rPr>
                 <w:b w:val="0"/>
                 <w:i w:val="0"/>
-                <w:sz w:val="18"/>
+                <w:sz w:val="17"/>
               </w:rPr>
               <w:t>, Wang S, Adams E, AlQuraishi M. GeneCtx: An Evaluation Framework for Dissecting Genomic Context Use in Genome Language Models. Submitted to NeurIPS 2026 Evaluations &amp; Datasets track.</w:t>
             </w:r>
@@ -1073,6 +1118,9 @@
         </w:tc>
       </w:tr>
       <w:tr>
+        <w:trPr>
+          <w:cantSplit/>
+        </w:trPr>
         <w:tc>
           <w:tcPr>
             <w:tcW w:type="dxa" w:w="1555"/>
@@ -1080,7 +1128,7 @@
           </w:tcPr>
           <w:p>
             <w:pPr>
-              <w:spacing w:after="30"/>
+              <w:spacing w:after="20"/>
             </w:pPr>
             <w:r>
               <w:rPr>
@@ -1099,13 +1147,13 @@
           </w:tcPr>
           <w:p>
             <w:pPr>
-              <w:spacing w:after="30"/>
+              <w:spacing w:after="20"/>
             </w:pPr>
             <w:r>
               <w:rPr>
                 <w:b w:val="0"/>
                 <w:i w:val="0"/>
-                <w:sz w:val="18"/>
+                <w:sz w:val="17"/>
               </w:rPr>
               <w:t xml:space="preserve">Liang C, Wagstaff J, </w:t>
             </w:r>
@@ -1113,7 +1161,7 @@
               <w:rPr>
                 <w:b/>
                 <w:i w:val="0"/>
-                <w:sz w:val="18"/>
+                <w:sz w:val="17"/>
               </w:rPr>
               <w:t>Aharony N</w:t>
             </w:r>
@@ -1121,7 +1169,7 @@
               <w:rPr>
                 <w:b w:val="0"/>
                 <w:i w:val="0"/>
-                <w:sz w:val="18"/>
+                <w:sz w:val="17"/>
               </w:rPr>
               <w:t xml:space="preserve">, Schmit V, Manheim D. Managing the Transition to Widespread Metagenomic Monitoring: Policy Considerations for Future Biosurveillance. </w:t>
             </w:r>
@@ -1129,7 +1177,7 @@
               <w:rPr>
                 <w:b w:val="0"/>
                 <w:i/>
-                <w:sz w:val="18"/>
+                <w:sz w:val="17"/>
               </w:rPr>
               <w:t>Health Security</w:t>
             </w:r>
@@ -1137,7 +1185,7 @@
               <w:rPr>
                 <w:b w:val="0"/>
                 <w:i w:val="0"/>
-                <w:sz w:val="18"/>
+                <w:sz w:val="17"/>
               </w:rPr>
               <w:t>, 21(1), 34-45.</w:t>
             </w:r>
@@ -1145,6 +1193,9 @@
         </w:tc>
       </w:tr>
       <w:tr>
+        <w:trPr>
+          <w:cantSplit/>
+        </w:trPr>
         <w:tc>
           <w:tcPr>
             <w:tcW w:type="dxa" w:w="1555"/>
@@ -1152,7 +1203,7 @@
           </w:tcPr>
           <w:p>
             <w:pPr>
-              <w:spacing w:after="30"/>
+              <w:spacing w:after="20"/>
             </w:pPr>
             <w:r>
               <w:rPr>
@@ -1171,13 +1222,13 @@
           </w:tcPr>
           <w:p>
             <w:pPr>
-              <w:spacing w:after="30"/>
+              <w:spacing w:after="20"/>
             </w:pPr>
             <w:r>
               <w:rPr>
                 <w:b w:val="0"/>
                 <w:i w:val="0"/>
-                <w:sz w:val="18"/>
+                <w:sz w:val="17"/>
               </w:rPr>
               <w:t xml:space="preserve">Myers A, Utpala S, Talbar S, Sanborn S, Shewmake C, Donnat C, Mathe J, Lupo U, Sonthalia R, Cui X, Szwagier T, Pignet A, Bergsson A, Hauberg S, Nielson D, Sommer S, Klindt D, Hermansen E, Vaupel M, Dunn B, Xiong J, </w:t>
             </w:r>
@@ -1185,7 +1236,7 @@
               <w:rPr>
                 <w:b/>
                 <w:i w:val="0"/>
-                <w:sz w:val="18"/>
+                <w:sz w:val="17"/>
               </w:rPr>
               <w:t>Aharony N</w:t>
             </w:r>
@@ -1193,7 +1244,7 @@
               <w:rPr>
                 <w:b w:val="0"/>
                 <w:i w:val="0"/>
-                <w:sz w:val="18"/>
+                <w:sz w:val="17"/>
               </w:rPr>
               <w:t>, Pe'er I, Ambellan F, Hanik M, Nava-Yazdani E, von Tycowicz C, Miolane N. ICLR 2022 Challenge for Computational Geometry &amp; Topology: Design and Results. arXiv.</w:t>
             </w:r>
@@ -1201,6 +1252,9 @@
         </w:tc>
       </w:tr>
       <w:tr>
+        <w:trPr>
+          <w:cantSplit/>
+        </w:trPr>
         <w:tc>
           <w:tcPr>
             <w:tcW w:type="dxa" w:w="1555"/>
@@ -1208,7 +1262,7 @@
           </w:tcPr>
           <w:p>
             <w:pPr>
-              <w:spacing w:after="30"/>
+              <w:spacing w:after="20"/>
             </w:pPr>
             <w:r>
               <w:rPr>
@@ -1227,13 +1281,13 @@
           </w:tcPr>
           <w:p>
             <w:pPr>
-              <w:spacing w:after="30"/>
+              <w:spacing w:after="20"/>
             </w:pPr>
             <w:r>
               <w:rPr>
                 <w:b w:val="0"/>
                 <w:i w:val="0"/>
-                <w:sz w:val="18"/>
+                <w:sz w:val="17"/>
               </w:rPr>
               <w:t xml:space="preserve">Milman O*, Yelin I*, </w:t>
             </w:r>
@@ -1241,7 +1295,7 @@
               <w:rPr>
                 <w:b/>
                 <w:i w:val="0"/>
-                <w:sz w:val="18"/>
+                <w:sz w:val="17"/>
               </w:rPr>
               <w:t>Aharony N</w:t>
             </w:r>
@@ -1249,7 +1303,7 @@
               <w:rPr>
                 <w:b w:val="0"/>
                 <w:i w:val="0"/>
-                <w:sz w:val="18"/>
+                <w:sz w:val="17"/>
               </w:rPr>
               <w:t xml:space="preserve">, Katz R, Herzel E, Ben-Tov A, Kuint J, Gazit S, Chodick G, Patalon T, Kishony R. Community-level evidence for SARS-CoV-2 vaccine protection of unvaccinated individuals. </w:t>
             </w:r>
@@ -1257,7 +1311,7 @@
               <w:rPr>
                 <w:b w:val="0"/>
                 <w:i/>
-                <w:sz w:val="18"/>
+                <w:sz w:val="17"/>
               </w:rPr>
               <w:t>Nature Medicine</w:t>
             </w:r>
@@ -1265,7 +1319,7 @@
               <w:rPr>
                 <w:b w:val="0"/>
                 <w:i w:val="0"/>
-                <w:sz w:val="18"/>
+                <w:sz w:val="17"/>
               </w:rPr>
               <w:t>.</w:t>
             </w:r>
@@ -1273,6 +1327,9 @@
         </w:tc>
       </w:tr>
       <w:tr>
+        <w:trPr>
+          <w:cantSplit/>
+        </w:trPr>
         <w:tc>
           <w:tcPr>
             <w:tcW w:type="dxa" w:w="1555"/>
@@ -1280,7 +1337,7 @@
           </w:tcPr>
           <w:p>
             <w:pPr>
-              <w:spacing w:after="30"/>
+              <w:spacing w:after="20"/>
             </w:pPr>
             <w:r>
               <w:rPr>
@@ -1299,13 +1356,13 @@
           </w:tcPr>
           <w:p>
             <w:pPr>
-              <w:spacing w:after="30"/>
+              <w:spacing w:after="20"/>
             </w:pPr>
             <w:r>
               <w:rPr>
                 <w:b w:val="0"/>
                 <w:i w:val="0"/>
-                <w:sz w:val="18"/>
+                <w:sz w:val="17"/>
               </w:rPr>
               <w:t xml:space="preserve">Yelin I*, </w:t>
             </w:r>
@@ -1313,7 +1370,7 @@
               <w:rPr>
                 <w:b/>
                 <w:i w:val="0"/>
-                <w:sz w:val="18"/>
+                <w:sz w:val="17"/>
               </w:rPr>
               <w:t>Aharony N*</w:t>
             </w:r>
@@ -1321,7 +1378,7 @@
               <w:rPr>
                 <w:b w:val="0"/>
                 <w:i w:val="0"/>
-                <w:sz w:val="18"/>
+                <w:sz w:val="17"/>
               </w:rPr>
               <w:t xml:space="preserve">, Shaer-Tamar E*, Argoetti A*, Messer E, Berenbaum D, Shafran E, Kuzil A, Gandali N, Hashimshony T, Mandel-Gutfreund Y, Halberthal M, Geffen Y, Szwarcwort-Cohen M, Kishony R. Evaluation of COVID-19 RT-qPCR test in multi-sample pools. </w:t>
             </w:r>
@@ -1329,7 +1386,7 @@
               <w:rPr>
                 <w:b w:val="0"/>
                 <w:i/>
-                <w:sz w:val="18"/>
+                <w:sz w:val="17"/>
               </w:rPr>
               <w:t>Clinical Infectious Diseases</w:t>
             </w:r>
@@ -1337,7 +1394,7 @@
               <w:rPr>
                 <w:b w:val="0"/>
                 <w:i w:val="0"/>
-                <w:sz w:val="18"/>
+                <w:sz w:val="17"/>
               </w:rPr>
               <w:t>.</w:t>
             </w:r>
@@ -1345,6 +1402,9 @@
         </w:tc>
       </w:tr>
       <w:tr>
+        <w:trPr>
+          <w:cantSplit/>
+        </w:trPr>
         <w:tc>
           <w:tcPr>
             <w:tcW w:type="dxa" w:w="1555"/>
@@ -1352,7 +1412,7 @@
           </w:tcPr>
           <w:p>
             <w:pPr>
-              <w:spacing w:after="30"/>
+              <w:spacing w:after="20"/>
             </w:pPr>
             <w:r>
               <w:rPr>
@@ -1371,13 +1431,13 @@
           </w:tcPr>
           <w:p>
             <w:pPr>
-              <w:spacing w:after="30"/>
+              <w:spacing w:after="20"/>
             </w:pPr>
             <w:r>
               <w:rPr>
                 <w:b w:val="0"/>
                 <w:i w:val="0"/>
-                <w:sz w:val="18"/>
+                <w:sz w:val="17"/>
               </w:rPr>
               <w:t xml:space="preserve">Moco PD, </w:t>
             </w:r>
@@ -1385,7 +1445,7 @@
               <w:rPr>
                 <w:b/>
                 <w:i w:val="0"/>
-                <w:sz w:val="18"/>
+                <w:sz w:val="17"/>
               </w:rPr>
               <w:t>Aharony N</w:t>
             </w:r>
@@ -1393,7 +1453,7 @@
               <w:rPr>
                 <w:b w:val="0"/>
                 <w:i w:val="0"/>
-                <w:sz w:val="18"/>
+                <w:sz w:val="17"/>
               </w:rPr>
               <w:t xml:space="preserve">, Kamen A. Adeno-Associated Viral Vectors for Homology-Directed Generation of CAR-T cells. </w:t>
             </w:r>
@@ -1401,7 +1461,7 @@
               <w:rPr>
                 <w:b w:val="0"/>
                 <w:i/>
-                <w:sz w:val="18"/>
+                <w:sz w:val="17"/>
               </w:rPr>
               <w:t>Biotechnology Journal</w:t>
             </w:r>
@@ -1409,7 +1469,7 @@
               <w:rPr>
                 <w:b w:val="0"/>
                 <w:i w:val="0"/>
-                <w:sz w:val="18"/>
+                <w:sz w:val="17"/>
               </w:rPr>
               <w:t>.</w:t>
             </w:r>
@@ -1438,6 +1498,9 @@
     </w:p>
     <w:tbl>
       <w:tr>
+        <w:trPr>
+          <w:cantSplit/>
+        </w:trPr>
         <w:tc>
           <w:tcPr>
             <w:tcW w:type="dxa" w:w="1555"/>
@@ -1445,7 +1508,7 @@
           </w:tcPr>
           <w:p>
             <w:pPr>
-              <w:spacing w:after="30"/>
+              <w:spacing w:after="20"/>
             </w:pPr>
             <w:r>
               <w:rPr>
@@ -1464,13 +1527,13 @@
           </w:tcPr>
           <w:p>
             <w:pPr>
-              <w:spacing w:after="30"/>
+              <w:spacing w:after="20"/>
             </w:pPr>
             <w:r>
               <w:rPr>
                 <w:b/>
                 <w:i w:val="0"/>
-                <w:sz w:val="18"/>
+                <w:sz w:val="17"/>
               </w:rPr>
               <w:t>Aharony N</w:t>
             </w:r>
@@ -1478,7 +1541,7 @@
               <w:rPr>
                 <w:b w:val="0"/>
                 <w:i w:val="0"/>
-                <w:sz w:val="18"/>
+                <w:sz w:val="17"/>
               </w:rPr>
               <w:t>, AlQuraishi M. Evaluating Genome Language Model Embeddings as Transferable Priors for Metagenomic Binning. Accepted poster, CIBB 2026. Rome, Italy, Sep 2–4, 2026.</w:t>
             </w:r>
@@ -1486,6 +1549,9 @@
         </w:tc>
       </w:tr>
       <w:tr>
+        <w:trPr>
+          <w:cantSplit/>
+        </w:trPr>
         <w:tc>
           <w:tcPr>
             <w:tcW w:type="dxa" w:w="1555"/>
@@ -1493,7 +1559,7 @@
           </w:tcPr>
           <w:p>
             <w:pPr>
-              <w:spacing w:after="30"/>
+              <w:spacing w:after="20"/>
             </w:pPr>
             <w:r>
               <w:rPr>
@@ -1512,13 +1578,13 @@
           </w:tcPr>
           <w:p>
             <w:pPr>
-              <w:spacing w:after="30"/>
+              <w:spacing w:after="20"/>
             </w:pPr>
             <w:r>
               <w:rPr>
                 <w:b/>
                 <w:i w:val="0"/>
-                <w:sz w:val="18"/>
+                <w:sz w:val="17"/>
               </w:rPr>
               <w:t>Aharony N</w:t>
             </w:r>
@@ -1526,7 +1592,7 @@
               <w:rPr>
                 <w:b w:val="0"/>
                 <w:i w:val="0"/>
-                <w:sz w:val="18"/>
+                <w:sz w:val="17"/>
               </w:rPr>
               <w:t>, Wang S, Neiswanger W. Benchmarking Genome Language Models for Novel Virus Detection in Wastewater Across Evolutionary Distance. Selected oral presentation, ASM BIG 2026. Washington, DC, Oct 11–14, 2026; talk Oct 13.</w:t>
             </w:r>
@@ -1552,6 +1618,9 @@
         <w:gridCol w:w="5040"/>
       </w:tblGrid>
       <w:tr>
+        <w:trPr>
+          <w:cantSplit/>
+        </w:trPr>
         <w:tc>
           <w:tcPr>
             <w:tcW w:type="dxa" w:w="1555"/>
@@ -1559,7 +1628,7 @@
           </w:tcPr>
           <w:p>
             <w:pPr>
-              <w:spacing w:after="30"/>
+              <w:spacing w:after="20"/>
             </w:pPr>
             <w:r>
               <w:rPr>
@@ -1578,13 +1647,13 @@
           </w:tcPr>
           <w:p>
             <w:pPr>
-              <w:spacing w:after="30"/>
+              <w:spacing w:after="20"/>
             </w:pPr>
             <w:r>
               <w:rPr>
                 <w:b/>
                 <w:i w:val="0"/>
-                <w:sz w:val="18"/>
+                <w:sz w:val="17"/>
               </w:rPr>
               <w:t xml:space="preserve">Le Lievre T*, </w:t>
             </w:r>
@@ -1592,7 +1661,7 @@
               <w:rPr>
                 <w:b w:val="0"/>
                 <w:i w:val="0"/>
-                <w:sz w:val="18"/>
+                <w:sz w:val="17"/>
               </w:rPr>
               <w:t>Aharony N*</w:t>
             </w:r>
@@ -1600,7 +1669,7 @@
               <w:rPr>
                 <w:b/>
                 <w:i w:val="0"/>
-                <w:sz w:val="18"/>
+                <w:sz w:val="17"/>
               </w:rPr>
               <w:t>, AlQuraishi M. PRIME-Bench: A Benchmark for Pathway-Level Reasoning in Genome Language Models. Poster, ISMB 2026.</w:t>
             </w:r>
@@ -1608,6 +1677,9 @@
         </w:tc>
       </w:tr>
       <w:tr>
+        <w:trPr>
+          <w:cantSplit/>
+        </w:trPr>
         <w:tc>
           <w:tcPr>
             <w:tcW w:type="dxa" w:w="1555"/>
@@ -1615,7 +1687,7 @@
           </w:tcPr>
           <w:p>
             <w:pPr>
-              <w:spacing w:after="30"/>
+              <w:spacing w:after="20"/>
             </w:pPr>
             <w:r>
               <w:rPr>
@@ -1634,13 +1706,13 @@
           </w:tcPr>
           <w:p>
             <w:pPr>
-              <w:spacing w:after="30"/>
+              <w:spacing w:after="20"/>
             </w:pPr>
             <w:r>
               <w:rPr>
                 <w:b/>
                 <w:i w:val="0"/>
-                <w:sz w:val="18"/>
+                <w:sz w:val="17"/>
               </w:rPr>
               <w:t>Aharony N</w:t>
             </w:r>
@@ -1648,7 +1720,7 @@
               <w:rPr>
                 <w:b w:val="0"/>
                 <w:i w:val="0"/>
-                <w:sz w:val="18"/>
+                <w:sz w:val="17"/>
               </w:rPr>
               <w:t>. Who Holds the Reins in Agent-Assisted Systems Biology? Accepted poster and extended abstract, NE AI Agents Day 2026.</w:t>
             </w:r>
@@ -1656,6 +1728,9 @@
         </w:tc>
       </w:tr>
       <w:tr>
+        <w:trPr>
+          <w:cantSplit/>
+        </w:trPr>
         <w:tc>
           <w:tcPr>
             <w:tcW w:type="dxa" w:w="1555"/>
@@ -1663,7 +1738,7 @@
           </w:tcPr>
           <w:p>
             <w:pPr>
-              <w:spacing w:after="30"/>
+              <w:spacing w:after="20"/>
             </w:pPr>
             <w:r>
               <w:rPr>
@@ -1682,13 +1757,13 @@
           </w:tcPr>
           <w:p>
             <w:pPr>
-              <w:spacing w:after="30"/>
+              <w:spacing w:after="20"/>
             </w:pPr>
             <w:r>
               <w:rPr>
                 <w:b/>
                 <w:i w:val="0"/>
-                <w:sz w:val="18"/>
+                <w:sz w:val="17"/>
               </w:rPr>
               <w:t>Aharony N</w:t>
             </w:r>
@@ -1696,7 +1771,7 @@
               <w:rPr>
                 <w:b w:val="0"/>
                 <w:i w:val="0"/>
-                <w:sz w:val="18"/>
+                <w:sz w:val="17"/>
               </w:rPr>
               <w:t>, AlQuraishi M. Evaluating Genome Language Models for Metagenomic Binning. Accepted poster, Pioneering Israeli Science Conference / ScienceAbroad 2026.</w:t>
             </w:r>
@@ -1704,6 +1779,9 @@
         </w:tc>
       </w:tr>
       <w:tr>
+        <w:trPr>
+          <w:cantSplit/>
+        </w:trPr>
         <w:tc>
           <w:tcPr>
             <w:tcW w:type="dxa" w:w="1555"/>
@@ -1711,7 +1789,7 @@
           </w:tcPr>
           <w:p>
             <w:pPr>
-              <w:spacing w:after="30"/>
+              <w:spacing w:after="20"/>
             </w:pPr>
             <w:r>
               <w:rPr>
@@ -1730,13 +1808,13 @@
           </w:tcPr>
           <w:p>
             <w:pPr>
-              <w:spacing w:after="30"/>
+              <w:spacing w:after="20"/>
             </w:pPr>
             <w:r>
               <w:rPr>
                 <w:b/>
                 <w:i w:val="0"/>
-                <w:sz w:val="18"/>
+                <w:sz w:val="17"/>
               </w:rPr>
               <w:t>Aharony N</w:t>
             </w:r>
@@ -1744,7 +1822,7 @@
               <w:rPr>
                 <w:b w:val="0"/>
                 <w:i w:val="0"/>
-                <w:sz w:val="18"/>
+                <w:sz w:val="17"/>
               </w:rPr>
               <w:t>. Rapid Talks and Panel: 2024 Innovative Tools &amp; Solutions Award Recipients. Flash talk and panelist, PRI.</w:t>
             </w:r>
@@ -1752,6 +1830,9 @@
         </w:tc>
       </w:tr>
       <w:tr>
+        <w:trPr>
+          <w:cantSplit/>
+        </w:trPr>
         <w:tc>
           <w:tcPr>
             <w:tcW w:type="dxa" w:w="1555"/>
@@ -1759,7 +1840,7 @@
           </w:tcPr>
           <w:p>
             <w:pPr>
-              <w:spacing w:after="30"/>
+              <w:spacing w:after="20"/>
             </w:pPr>
             <w:r>
               <w:rPr>
@@ -1778,13 +1859,13 @@
           </w:tcPr>
           <w:p>
             <w:pPr>
-              <w:spacing w:after="30"/>
+              <w:spacing w:after="20"/>
             </w:pPr>
             <w:r>
               <w:rPr>
                 <w:b/>
                 <w:i w:val="0"/>
-                <w:sz w:val="18"/>
+                <w:sz w:val="17"/>
               </w:rPr>
               <w:t>Aharony N</w:t>
             </w:r>
@@ -1792,7 +1873,7 @@
               <w:rPr>
                 <w:b w:val="0"/>
                 <w:i w:val="0"/>
-                <w:sz w:val="18"/>
+                <w:sz w:val="17"/>
               </w:rPr>
               <w:t>. Genome Language Models Reading the Future of Pandemics in Wastewater. Flash talk, PRI Innovation Showcase.</w:t>
             </w:r>
@@ -1800,6 +1881,9 @@
         </w:tc>
       </w:tr>
       <w:tr>
+        <w:trPr>
+          <w:cantSplit/>
+        </w:trPr>
         <w:tc>
           <w:tcPr>
             <w:tcW w:type="dxa" w:w="1555"/>
@@ -1807,7 +1891,7 @@
           </w:tcPr>
           <w:p>
             <w:pPr>
-              <w:spacing w:after="30"/>
+              <w:spacing w:after="20"/>
             </w:pPr>
             <w:r>
               <w:rPr>
@@ -1826,13 +1910,13 @@
           </w:tcPr>
           <w:p>
             <w:pPr>
-              <w:spacing w:after="30"/>
+              <w:spacing w:after="20"/>
             </w:pPr>
             <w:r>
               <w:rPr>
                 <w:b/>
                 <w:i w:val="0"/>
-                <w:sz w:val="18"/>
+                <w:sz w:val="17"/>
               </w:rPr>
               <w:t>Aharony N</w:t>
             </w:r>
@@ -1840,7 +1924,7 @@
               <w:rPr>
                 <w:b w:val="0"/>
                 <w:i w:val="0"/>
-                <w:sz w:val="18"/>
+                <w:sz w:val="17"/>
               </w:rPr>
               <w:t>. Computational Methods for Pandemic Pathogen Detection. Flash talk, Singer Symposium.</w:t>
             </w:r>
@@ -1848,6 +1932,9 @@
         </w:tc>
       </w:tr>
       <w:tr>
+        <w:trPr>
+          <w:cantSplit/>
+        </w:trPr>
         <w:tc>
           <w:tcPr>
             <w:tcW w:type="dxa" w:w="1555"/>
@@ -1855,7 +1942,7 @@
           </w:tcPr>
           <w:p>
             <w:pPr>
-              <w:spacing w:after="30"/>
+              <w:spacing w:after="20"/>
             </w:pPr>
             <w:r>
               <w:rPr>
@@ -1874,13 +1961,13 @@
           </w:tcPr>
           <w:p>
             <w:pPr>
-              <w:spacing w:after="30"/>
+              <w:spacing w:after="20"/>
             </w:pPr>
             <w:r>
               <w:rPr>
                 <w:b/>
                 <w:i w:val="0"/>
-                <w:sz w:val="18"/>
+                <w:sz w:val="17"/>
               </w:rPr>
               <w:t>Aharony N</w:t>
             </w:r>
@@ -1888,7 +1975,7 @@
               <w:rPr>
                 <w:b w:val="0"/>
                 <w:i w:val="0"/>
-                <w:sz w:val="18"/>
+                <w:sz w:val="17"/>
               </w:rPr>
               <w:t>, Kishony R. Rapid Alteration in Genetic Content Upon Recurring Infection. Poster, EMBL Symposium: New Approaches and Concepts in Microbiology.</w:t>
             </w:r>
@@ -1896,6 +1983,9 @@
         </w:tc>
       </w:tr>
       <w:tr>
+        <w:trPr>
+          <w:cantSplit/>
+        </w:trPr>
         <w:tc>
           <w:tcPr>
             <w:tcW w:type="dxa" w:w="1555"/>
@@ -1903,7 +1993,7 @@
           </w:tcPr>
           <w:p>
             <w:pPr>
-              <w:spacing w:after="30"/>
+              <w:spacing w:after="20"/>
             </w:pPr>
             <w:r>
               <w:rPr>
@@ -1922,13 +2012,13 @@
           </w:tcPr>
           <w:p>
             <w:pPr>
-              <w:spacing w:after="30"/>
+              <w:spacing w:after="20"/>
             </w:pPr>
             <w:r>
               <w:rPr>
                 <w:b/>
                 <w:i w:val="0"/>
-                <w:sz w:val="18"/>
+                <w:sz w:val="17"/>
               </w:rPr>
               <w:t>Aharony N</w:t>
             </w:r>
@@ -1936,7 +2026,7 @@
               <w:rPr>
                 <w:b w:val="0"/>
                 <w:i w:val="0"/>
-                <w:sz w:val="18"/>
+                <w:sz w:val="17"/>
               </w:rPr>
               <w:t>. Careers in Biosecurity. Flash talk, EAGx Virtual.</w:t>
             </w:r>
@@ -1944,6 +2034,9 @@
         </w:tc>
       </w:tr>
       <w:tr>
+        <w:trPr>
+          <w:cantSplit/>
+        </w:trPr>
         <w:tc>
           <w:tcPr>
             <w:tcW w:type="dxa" w:w="1555"/>
@@ -1951,7 +2044,7 @@
           </w:tcPr>
           <w:p>
             <w:pPr>
-              <w:spacing w:after="30"/>
+              <w:spacing w:after="20"/>
             </w:pPr>
             <w:r>
               <w:rPr>
@@ -1970,13 +2063,13 @@
           </w:tcPr>
           <w:p>
             <w:pPr>
-              <w:spacing w:after="30"/>
+              <w:spacing w:after="20"/>
             </w:pPr>
             <w:r>
               <w:rPr>
                 <w:b/>
                 <w:i w:val="0"/>
-                <w:sz w:val="18"/>
+                <w:sz w:val="17"/>
               </w:rPr>
               <w:t>Aharony N</w:t>
             </w:r>
@@ -1984,7 +2077,7 @@
               <w:rPr>
                 <w:b w:val="0"/>
                 <w:i w:val="0"/>
-                <w:sz w:val="18"/>
+                <w:sz w:val="17"/>
               </w:rPr>
               <w:t>, Gronvall G. How Secure is the Gene Synthesis Industry? Poster, Biological Weapons Convention: Meeting of Experts.</w:t>
             </w:r>
@@ -2003,6 +2096,9 @@
     </w:p>
     <w:tbl>
       <w:tr>
+        <w:trPr>
+          <w:cantSplit/>
+        </w:trPr>
         <w:tc>
           <w:tcPr>
             <w:tcW w:type="dxa" w:w="1555"/>
@@ -2010,7 +2106,7 @@
           </w:tcPr>
           <w:p>
             <w:pPr>
-              <w:spacing w:after="30"/>
+              <w:spacing w:after="20"/>
             </w:pPr>
             <w:r>
               <w:rPr>
@@ -2029,13 +2125,13 @@
           </w:tcPr>
           <w:p>
             <w:pPr>
-              <w:spacing w:after="30"/>
+              <w:spacing w:after="20"/>
             </w:pPr>
             <w:r>
               <w:rPr>
                 <w:b w:val="0"/>
                 <w:i w:val="0"/>
-                <w:sz w:val="18"/>
+                <w:sz w:val="17"/>
               </w:rPr>
               <w:t>Pivotal Research Frontier Biodefense Fellowship.</w:t>
             </w:r>
@@ -2043,6 +2139,9 @@
         </w:tc>
       </w:tr>
       <w:tr>
+        <w:trPr>
+          <w:cantSplit/>
+        </w:trPr>
         <w:tc>
           <w:tcPr>
             <w:tcW w:type="dxa" w:w="1555"/>
@@ -2050,7 +2149,7 @@
           </w:tcPr>
           <w:p>
             <w:pPr>
-              <w:spacing w:after="30"/>
+              <w:spacing w:after="20"/>
             </w:pPr>
             <w:r>
               <w:rPr>
@@ -2069,13 +2168,13 @@
           </w:tcPr>
           <w:p>
             <w:pPr>
-              <w:spacing w:after="30"/>
+              <w:spacing w:after="20"/>
             </w:pPr>
             <w:r>
               <w:rPr>
                 <w:b w:val="0"/>
                 <w:i w:val="0"/>
-                <w:sz w:val="18"/>
+                <w:sz w:val="17"/>
               </w:rPr>
               <w:t>ML Alignment &amp; Theory Scholars (MATS) Program, Autumn 2026.</w:t>
             </w:r>
@@ -2101,6 +2200,9 @@
         <w:gridCol w:w="5040"/>
       </w:tblGrid>
       <w:tr>
+        <w:trPr>
+          <w:cantSplit/>
+        </w:trPr>
         <w:tc>
           <w:tcPr>
             <w:tcW w:type="dxa" w:w="1555"/>
@@ -2108,7 +2210,7 @@
           </w:tcPr>
           <w:p>
             <w:pPr>
-              <w:spacing w:after="30"/>
+              <w:spacing w:after="20"/>
             </w:pPr>
             <w:r>
               <w:rPr>
@@ -2127,13 +2229,13 @@
           </w:tcPr>
           <w:p>
             <w:pPr>
-              <w:spacing w:after="30"/>
+              <w:spacing w:after="20"/>
             </w:pPr>
             <w:r>
               <w:rPr>
                 <w:b w:val="0"/>
                 <w:i w:val="0"/>
-                <w:sz w:val="18"/>
+                <w:sz w:val="17"/>
               </w:rPr>
               <w:t>NYC-PRI Innovative Tools and Solutions to Address Public Health Emergencies.</w:t>
             </w:r>
@@ -2141,6 +2243,9 @@
         </w:tc>
       </w:tr>
       <w:tr>
+        <w:trPr>
+          <w:cantSplit/>
+        </w:trPr>
         <w:tc>
           <w:tcPr>
             <w:tcW w:type="dxa" w:w="1555"/>
@@ -2148,7 +2253,7 @@
           </w:tcPr>
           <w:p>
             <w:pPr>
-              <w:spacing w:after="30"/>
+              <w:spacing w:after="20"/>
             </w:pPr>
             <w:r>
               <w:rPr>
@@ -2167,13 +2272,13 @@
           </w:tcPr>
           <w:p>
             <w:pPr>
-              <w:spacing w:after="30"/>
+              <w:spacing w:after="20"/>
             </w:pPr>
             <w:r>
               <w:rPr>
                 <w:b w:val="0"/>
                 <w:i w:val="0"/>
-                <w:sz w:val="18"/>
+                <w:sz w:val="17"/>
               </w:rPr>
               <w:t>EA Funds PhD Support Scholarship.</w:t>
             </w:r>
@@ -2181,6 +2286,9 @@
         </w:tc>
       </w:tr>
       <w:tr>
+        <w:trPr>
+          <w:cantSplit/>
+        </w:trPr>
         <w:tc>
           <w:tcPr>
             <w:tcW w:type="dxa" w:w="1555"/>
@@ -2188,7 +2296,7 @@
           </w:tcPr>
           <w:p>
             <w:pPr>
-              <w:spacing w:after="30"/>
+              <w:spacing w:after="20"/>
             </w:pPr>
             <w:r>
               <w:rPr>
@@ -2207,13 +2315,13 @@
           </w:tcPr>
           <w:p>
             <w:pPr>
-              <w:spacing w:after="30"/>
+              <w:spacing w:after="20"/>
             </w:pPr>
             <w:r>
               <w:rPr>
                 <w:b w:val="0"/>
                 <w:i w:val="0"/>
-                <w:sz w:val="18"/>
+                <w:sz w:val="17"/>
               </w:rPr>
               <w:t>Open Philanthropy Early-Career Funding.</w:t>
             </w:r>
@@ -2221,6 +2329,9 @@
         </w:tc>
       </w:tr>
       <w:tr>
+        <w:trPr>
+          <w:cantSplit/>
+        </w:trPr>
         <w:tc>
           <w:tcPr>
             <w:tcW w:type="dxa" w:w="1555"/>
@@ -2228,7 +2339,7 @@
           </w:tcPr>
           <w:p>
             <w:pPr>
-              <w:spacing w:after="30"/>
+              <w:spacing w:after="20"/>
             </w:pPr>
             <w:r>
               <w:rPr>
@@ -2247,13 +2358,13 @@
           </w:tcPr>
           <w:p>
             <w:pPr>
-              <w:spacing w:after="30"/>
+              <w:spacing w:after="20"/>
             </w:pPr>
             <w:r>
               <w:rPr>
                 <w:b w:val="0"/>
                 <w:i w:val="0"/>
-                <w:sz w:val="18"/>
+                <w:sz w:val="17"/>
               </w:rPr>
               <w:t>Miriam and Aaron Gutwirth Memorial Fellowship for Excellence in Research.</w:t>
             </w:r>
@@ -2261,6 +2372,9 @@
         </w:tc>
       </w:tr>
       <w:tr>
+        <w:trPr>
+          <w:cantSplit/>
+        </w:trPr>
         <w:tc>
           <w:tcPr>
             <w:tcW w:type="dxa" w:w="1555"/>
@@ -2268,7 +2382,7 @@
           </w:tcPr>
           <w:p>
             <w:pPr>
-              <w:spacing w:after="30"/>
+              <w:spacing w:after="20"/>
             </w:pPr>
             <w:r>
               <w:rPr>
@@ -2287,13 +2401,13 @@
           </w:tcPr>
           <w:p>
             <w:pPr>
-              <w:spacing w:after="30"/>
+              <w:spacing w:after="20"/>
             </w:pPr>
             <w:r>
               <w:rPr>
                 <w:b w:val="0"/>
                 <w:i w:val="0"/>
-                <w:sz w:val="18"/>
+                <w:sz w:val="17"/>
               </w:rPr>
               <w:t>Leonard and Diane Sherman Interdisciplinary Graduate School Fellowship.</w:t>
             </w:r>
@@ -2301,6 +2415,9 @@
         </w:tc>
       </w:tr>
       <w:tr>
+        <w:trPr>
+          <w:cantSplit/>
+        </w:trPr>
         <w:tc>
           <w:tcPr>
             <w:tcW w:type="dxa" w:w="1555"/>
@@ -2308,7 +2425,7 @@
           </w:tcPr>
           <w:p>
             <w:pPr>
-              <w:spacing w:after="30"/>
+              <w:spacing w:after="20"/>
             </w:pPr>
             <w:r>
               <w:rPr>
@@ -2327,13 +2444,13 @@
           </w:tcPr>
           <w:p>
             <w:pPr>
-              <w:spacing w:after="30"/>
+              <w:spacing w:after="20"/>
             </w:pPr>
             <w:r>
               <w:rPr>
                 <w:b w:val="0"/>
                 <w:i w:val="0"/>
-                <w:sz w:val="18"/>
+                <w:sz w:val="17"/>
               </w:rPr>
               <w:t>Open Philanthropy Early-Career Funding for Global Biological Risks.</w:t>
             </w:r>
@@ -2341,6 +2458,9 @@
         </w:tc>
       </w:tr>
       <w:tr>
+        <w:trPr>
+          <w:cantSplit/>
+        </w:trPr>
         <w:tc>
           <w:tcPr>
             <w:tcW w:type="dxa" w:w="1555"/>
@@ -2348,7 +2468,7 @@
           </w:tcPr>
           <w:p>
             <w:pPr>
-              <w:spacing w:after="30"/>
+              <w:spacing w:after="20"/>
             </w:pPr>
             <w:r>
               <w:rPr>
@@ -2367,13 +2487,13 @@
           </w:tcPr>
           <w:p>
             <w:pPr>
-              <w:spacing w:after="30"/>
+              <w:spacing w:after="20"/>
             </w:pPr>
             <w:r>
               <w:rPr>
                 <w:b w:val="0"/>
                 <w:i w:val="0"/>
-                <w:sz w:val="18"/>
+                <w:sz w:val="17"/>
               </w:rPr>
               <w:t>McGill University Faculty of Science Scholarship.</w:t>
             </w:r>
@@ -2381,6 +2501,9 @@
         </w:tc>
       </w:tr>
       <w:tr>
+        <w:trPr>
+          <w:cantSplit/>
+        </w:trPr>
         <w:tc>
           <w:tcPr>
             <w:tcW w:type="dxa" w:w="1555"/>
@@ -2388,7 +2511,7 @@
           </w:tcPr>
           <w:p>
             <w:pPr>
-              <w:spacing w:after="30"/>
+              <w:spacing w:after="20"/>
             </w:pPr>
             <w:r>
               <w:rPr>
@@ -2407,13 +2530,13 @@
           </w:tcPr>
           <w:p>
             <w:pPr>
-              <w:spacing w:after="30"/>
+              <w:spacing w:after="20"/>
             </w:pPr>
             <w:r>
               <w:rPr>
                 <w:b w:val="0"/>
                 <w:i w:val="0"/>
-                <w:sz w:val="18"/>
+                <w:sz w:val="17"/>
               </w:rPr>
               <w:t>CIHR Undergraduate Research Award in Computational Biology.</w:t>
             </w:r>
@@ -2421,6 +2544,9 @@
         </w:tc>
       </w:tr>
       <w:tr>
+        <w:trPr>
+          <w:cantSplit/>
+        </w:trPr>
         <w:tc>
           <w:tcPr>
             <w:tcW w:type="dxa" w:w="1555"/>
@@ -2428,7 +2554,7 @@
           </w:tcPr>
           <w:p>
             <w:pPr>
-              <w:spacing w:after="30"/>
+              <w:spacing w:after="20"/>
             </w:pPr>
             <w:r>
               <w:rPr>
@@ -2447,13 +2573,13 @@
           </w:tcPr>
           <w:p>
             <w:pPr>
-              <w:spacing w:after="30"/>
+              <w:spacing w:after="20"/>
             </w:pPr>
             <w:r>
               <w:rPr>
                 <w:b w:val="0"/>
                 <w:i w:val="0"/>
-                <w:sz w:val="18"/>
+                <w:sz w:val="17"/>
               </w:rPr>
               <w:t>NSERC Undergraduate Student Research Award; FRQNT Top-Up to NSERC Undergraduate Student Research Award.</w:t>
             </w:r>
@@ -2490,6 +2616,9 @@
         <w:gridCol w:w="5040"/>
       </w:tblGrid>
       <w:tr>
+        <w:trPr>
+          <w:cantSplit/>
+        </w:trPr>
         <w:tc>
           <w:tcPr>
             <w:tcW w:type="dxa" w:w="1555"/>
@@ -2497,7 +2626,7 @@
           </w:tcPr>
           <w:p>
             <w:pPr>
-              <w:spacing w:after="30"/>
+              <w:spacing w:after="20"/>
             </w:pPr>
             <w:r>
               <w:rPr>
@@ -2516,13 +2645,13 @@
           </w:tcPr>
           <w:p>
             <w:pPr>
-              <w:spacing w:after="30"/>
+              <w:spacing w:after="20"/>
             </w:pPr>
             <w:r>
               <w:rPr>
                 <w:b/>
                 <w:i w:val="0"/>
-                <w:sz w:val="18"/>
+                <w:sz w:val="17"/>
               </w:rPr>
               <w:t>Teaching Assistant</w:t>
             </w:r>
@@ -2530,7 +2659,7 @@
               <w:rPr>
                 <w:b w:val="0"/>
                 <w:i w:val="0"/>
-                <w:sz w:val="18"/>
+                <w:sz w:val="17"/>
               </w:rPr>
               <w:t>, McGill University</w:t>
             </w:r>
@@ -2541,7 +2670,7 @@
               <w:rPr>
                 <w:b w:val="0"/>
                 <w:i w:val="0"/>
-                <w:sz w:val="18"/>
+                <w:sz w:val="17"/>
               </w:rPr>
               <w:t>Created problem sets, held office hours, and led review sessions for biochemistry, molecular biology, neuroscience, and introductory physics courses.</w:t>
             </w:r>
@@ -2549,6 +2678,9 @@
         </w:tc>
       </w:tr>
       <w:tr>
+        <w:trPr>
+          <w:cantSplit/>
+        </w:trPr>
         <w:tc>
           <w:tcPr>
             <w:tcW w:type="dxa" w:w="1555"/>
@@ -2556,7 +2688,7 @@
           </w:tcPr>
           <w:p>
             <w:pPr>
-              <w:spacing w:after="30"/>
+              <w:spacing w:after="20"/>
             </w:pPr>
             <w:r>
               <w:rPr>
@@ -2575,13 +2707,13 @@
           </w:tcPr>
           <w:p>
             <w:pPr>
-              <w:spacing w:after="30"/>
+              <w:spacing w:after="20"/>
             </w:pPr>
             <w:r>
               <w:rPr>
                 <w:b/>
                 <w:i w:val="0"/>
-                <w:sz w:val="18"/>
+                <w:sz w:val="17"/>
               </w:rPr>
               <w:t>Research and career mentorship</w:t>
             </w:r>
@@ -2592,7 +2724,7 @@
               <w:rPr>
                 <w:b w:val="0"/>
                 <w:i w:val="0"/>
-                <w:sz w:val="18"/>
+                <w:sz w:val="17"/>
               </w:rPr>
               <w:t>Mentored students and early-career professionals interested in biosecurity and computational biology projects through Effective Thesis Project and 80,000 Hours referrals.</w:t>
             </w:r>
@@ -2600,6 +2732,9 @@
         </w:tc>
       </w:tr>
       <w:tr>
+        <w:trPr>
+          <w:cantSplit/>
+        </w:trPr>
         <w:tc>
           <w:tcPr>
             <w:tcW w:type="dxa" w:w="1555"/>
@@ -2607,7 +2742,7 @@
           </w:tcPr>
           <w:p>
             <w:pPr>
-              <w:spacing w:after="30"/>
+              <w:spacing w:after="20"/>
             </w:pPr>
             <w:r>
               <w:rPr>
@@ -2626,13 +2761,13 @@
           </w:tcPr>
           <w:p>
             <w:pPr>
-              <w:spacing w:after="30"/>
+              <w:spacing w:after="20"/>
             </w:pPr>
             <w:r>
               <w:rPr>
                 <w:b/>
                 <w:i w:val="0"/>
-                <w:sz w:val="18"/>
+                <w:sz w:val="17"/>
               </w:rPr>
               <w:t>Volunteer Consultant</w:t>
             </w:r>
@@ -2640,7 +2775,7 @@
               <w:rPr>
                 <w:b w:val="0"/>
                 <w:i w:val="0"/>
-                <w:sz w:val="18"/>
+                <w:sz w:val="17"/>
               </w:rPr>
               <w:t>, Battelle Memorial Institute / ThreatSEQ</w:t>
             </w:r>
@@ -2651,7 +2786,7 @@
               <w:rPr>
                 <w:b w:val="0"/>
                 <w:i w:val="0"/>
-                <w:sz w:val="18"/>
+                <w:sz w:val="17"/>
               </w:rPr>
               <w:t>Consulted on a ThreatSEQ joint initiative with the FBI assessing whether gene synthesis companies would detect orders containing genes from the Select Agents list.</w:t>
             </w:r>
@@ -2688,6 +2823,9 @@
         <w:gridCol w:w="5040"/>
       </w:tblGrid>
       <w:tr>
+        <w:trPr>
+          <w:cantSplit/>
+        </w:trPr>
         <w:tc>
           <w:tcPr>
             <w:tcW w:type="dxa" w:w="1555"/>
@@ -2695,7 +2833,7 @@
           </w:tcPr>
           <w:p>
             <w:pPr>
-              <w:spacing w:after="30"/>
+              <w:spacing w:after="20"/>
             </w:pPr>
             <w:r>
               <w:rPr>
@@ -2714,13 +2852,13 @@
           </w:tcPr>
           <w:p>
             <w:pPr>
-              <w:spacing w:after="30"/>
+              <w:spacing w:after="20"/>
             </w:pPr>
             <w:r>
               <w:rPr>
                 <w:b w:val="0"/>
                 <w:i w:val="0"/>
-                <w:sz w:val="18"/>
+                <w:sz w:val="17"/>
               </w:rPr>
               <w:t>Python, R, MATLAB, C/C++, Java; biological language model evaluation; sequence modeling; metagenomic analysis; hyperbolic embeddings; genomic pipeline development.</w:t>
             </w:r>
@@ -2728,6 +2866,9 @@
         </w:tc>
       </w:tr>
       <w:tr>
+        <w:trPr>
+          <w:cantSplit/>
+        </w:trPr>
         <w:tc>
           <w:tcPr>
             <w:tcW w:type="dxa" w:w="1555"/>
@@ -2735,7 +2876,7 @@
           </w:tcPr>
           <w:p>
             <w:pPr>
-              <w:spacing w:after="30"/>
+              <w:spacing w:after="20"/>
             </w:pPr>
             <w:r>
               <w:rPr>
@@ -2754,13 +2895,13 @@
           </w:tcPr>
           <w:p>
             <w:pPr>
-              <w:spacing w:after="30"/>
+              <w:spacing w:after="20"/>
             </w:pPr>
             <w:r>
               <w:rPr>
                 <w:b w:val="0"/>
                 <w:i w:val="0"/>
-                <w:sz w:val="18"/>
+                <w:sz w:val="17"/>
               </w:rPr>
               <w:t>Microbial evolution experiments; AAV vector production; CRISPR/Cas9 delivery; molecular biology workflows.</w:t>
             </w:r>
@@ -2768,6 +2909,9 @@
         </w:tc>
       </w:tr>
       <w:tr>
+        <w:trPr>
+          <w:cantSplit/>
+        </w:trPr>
         <w:tc>
           <w:tcPr>
             <w:tcW w:type="dxa" w:w="1555"/>
@@ -2775,7 +2919,7 @@
           </w:tcPr>
           <w:p>
             <w:pPr>
-              <w:spacing w:after="30"/>
+              <w:spacing w:after="20"/>
             </w:pPr>
             <w:r>
               <w:rPr>
@@ -2794,13 +2938,13 @@
           </w:tcPr>
           <w:p>
             <w:pPr>
-              <w:spacing w:after="30"/>
+              <w:spacing w:after="20"/>
             </w:pPr>
             <w:r>
               <w:rPr>
                 <w:b w:val="0"/>
                 <w:i w:val="0"/>
-                <w:sz w:val="18"/>
+                <w:sz w:val="17"/>
               </w:rPr>
               <w:t>Hebrew (native), English (near-native), French (novice).</w:t>
             </w:r>
@@ -2811,7 +2955,7 @@
     <w:sectPr>
       <w:footerReference w:type="default" r:id="rId9"/>
       <w:pgSz w:w="12240" w:h="15840"/>
-      <w:pgMar w:top="1008" w:right="1080" w:bottom="1008" w:left="1080" w:header="720" w:footer="720" w:gutter="0"/>
+      <w:pgMar w:top="792" w:right="1080" w:bottom="792" w:left="1080" w:header="720" w:footer="720" w:gutter="0"/>
       <w:cols w:space="720"/>
       <w:docGrid w:linePitch="360"/>
     </w:sectPr>
@@ -2831,7 +2975,7 @@
         <w:color w:val="666666"/>
         <w:sz w:val="16"/>
       </w:rPr>
-      <w:t>Noga Aharony CV | May 2026</w:t>
+      <w:t>Noga Aharony CV | August 2026</w:t>
     </w:r>
   </w:p>
 </w:ftr>

</xml_diff>

<commit_message>
fix: refine research focus and publication list
</commit_message>
<xml_diff>
--- a/Noga_Aharony_CV_Academic_August_2026.docx
+++ b/Noga_Aharony_CV_Academic_August_2026.docx
@@ -1847,95 +1847,6 @@
               <w:t xml:space="preserve">P03  </w:t>
             </w:r>
             <w:r>
-              <w:t xml:space="preserve">Myers A, Utpala S, Talbar S, Sanborn S, Shewmake C, Donnat C, Mathe J, Lupo U, Sonthalia R, Cui X, Szwagier T, Pignet A, Bergsson A, Hauberg S, Nielson D, Sommer S, Klindt D, Hermansen E, Vaupel M, Dunn B, Xiong J, </w:t>
-            </w:r>
-            <w:r>
-              <w:rPr>
-                <w:b/>
-              </w:rPr>
-              <w:t>Aharony N</w:t>
-            </w:r>
-            <w:r>
-              <w:t xml:space="preserve">, Pe’er I, Ambellan F, Hanik M, Nava-Yazdani E, von Tycowicz C, Miolane N. </w:t>
-            </w:r>
-            <w:r>
-              <w:rPr>
-                <w:i/>
-              </w:rPr>
-              <w:t xml:space="preserve">ICLR 2022 Challenge for Computational Geometry &amp; Topology: Design and Results. </w:t>
-            </w:r>
-            <w:r>
-              <w:t>arXiv.</w:t>
-            </w:r>
-          </w:p>
-        </w:tc>
-        <w:tc>
-          <w:tcPr>
-            <w:tcW w:type="dxa" w:w="1296"/>
-            <w:tcMar>
-              <w:top w:w="20" w:type="dxa"/>
-              <w:start w:w="0" w:type="dxa"/>
-              <w:bottom w:w="75" w:type="dxa"/>
-              <w:end w:w="0" w:type="dxa"/>
-            </w:tcMar>
-            <w:vAlign w:val="top"/>
-          </w:tcPr>
-          <w:p>
-            <w:pPr>
-              <w:pStyle w:val="CVDate"/>
-              <w:spacing w:after="0"/>
-              <w:jc w:val="right"/>
-            </w:pPr>
-            <w:r>
-              <w:t>2022</w:t>
-            </w:r>
-          </w:p>
-        </w:tc>
-      </w:tr>
-    </w:tbl>
-    <w:tbl>
-      <w:tblPr>
-        <w:tblW w:type="dxa" w:w="9820"/>
-        <w:jc w:val="left"/>
-        <w:tblLayout w:type="fixed"/>
-        <w:tblLook w:firstColumn="1" w:firstRow="1" w:lastColumn="0" w:lastRow="0" w:noHBand="0" w:noVBand="1" w:val="04A0"/>
-        <w:tblInd w:w="548" w:type="dxa"/>
-      </w:tblPr>
-      <w:tblGrid>
-        <w:gridCol w:w="8524"/>
-        <w:gridCol w:w="1296"/>
-      </w:tblGrid>
-      <w:tr>
-        <w:trPr>
-          <w:cantSplit/>
-        </w:trPr>
-        <w:tc>
-          <w:tcPr>
-            <w:tcW w:type="dxa" w:w="8524"/>
-            <w:tcMar>
-              <w:top w:w="20" w:type="dxa"/>
-              <w:start w:w="0" w:type="dxa"/>
-              <w:bottom w:w="75" w:type="dxa"/>
-              <w:end w:w="0" w:type="dxa"/>
-            </w:tcMar>
-            <w:vAlign w:val="top"/>
-          </w:tcPr>
-          <w:p>
-            <w:pPr>
-              <w:pStyle w:val="CVPublication"/>
-              <w:spacing w:after="0"/>
-            </w:pPr>
-            <w:r>
-              <w:rPr>
-                <w:rFonts w:ascii="Courier New" w:hAnsi="Courier New" w:cs="Courier New"/>
-                <w:b/>
-                <w:i w:val="0"/>
-                <w:color w:val="24497F"/>
-                <w:sz w:val="15"/>
-              </w:rPr>
-              <w:t xml:space="preserve">P04  </w:t>
-            </w:r>
-            <w:r>
               <w:t xml:space="preserve">Milman O*, Yelin I*, </w:t>
             </w:r>
             <w:r>
@@ -2022,7 +1933,7 @@
                 <w:color w:val="24497F"/>
                 <w:sz w:val="15"/>
               </w:rPr>
-              <w:t xml:space="preserve">P05  </w:t>
+              <w:t xml:space="preserve">P04  </w:t>
             </w:r>
             <w:r>
               <w:t xml:space="preserve">Yelin I*, </w:t>
@@ -2111,7 +2022,7 @@
                 <w:color w:val="24497F"/>
                 <w:sz w:val="15"/>
               </w:rPr>
-              <w:t xml:space="preserve">P06  </w:t>
+              <w:t xml:space="preserve">P05  </w:t>
             </w:r>
             <w:r>
               <w:t xml:space="preserve">Moco PD, </w:t>

</xml_diff>